<commit_message>
docs: synchronize manuals with latest interface baseline
</commit_message>
<xml_diff>
--- a/docs/manuals/01-心情日历-功能需求说明书.docx
+++ b/docs/manuals/01-心情日历-功能需求说明书.docx
@@ -244,7 +244,7 @@
                 <w:color w:val="000000"/>
                 <w:sz w:val="20"/>
               </w:rPr>
-              <w:t>仓库基线 21c7fc9  功能代码基线 cb6e6b9</w:t>
+              <w:t>仓库与功能代码基线 160f96e</w:t>
             </w:r>
           </w:p>
         </w:tc>
@@ -305,7 +305,7 @@
                 <w:color w:val="000000"/>
                 <w:sz w:val="20"/>
               </w:rPr>
-              <w:t>2026年9月18日</w:t>
+              <w:t>2026年9月20日</w:t>
             </w:r>
           </w:p>
         </w:tc>
@@ -808,7 +808,7 @@
                 <w:color w:val="000000"/>
                 <w:sz w:val="20"/>
               </w:rPr>
-              <w:t>补齐原有功能全量回归</w:t>
+              <w:t>补充设置、编辑与详情的多状态交互截图及无障碍验收</w:t>
             </w:r>
           </w:p>
         </w:tc>
@@ -4539,7 +4539,7 @@
           <w:color w:val="000000"/>
           <w:sz w:val="22"/>
         </w:rPr>
-        <w:t>验证依据：docs/testing/ 下的 2026-09-18-功能测试报告.md 与 2026-09-18-UI优化验收.md。结果对应既有测试基线。</w:t>
+        <w:t>本次同步确认：主要原有页面已统一主题并补充横屏、大字体和紧凑尺寸适配；AA退出审核已并入教师预警工作台。设置、编辑和详情仍需补充多状态交互截图及无障碍验收。验证依据：docs/testing/ 下的 2026-09-18-功能测试报告.md、2026-09-18-UI优化验收.md 和 2026-09-19-界面适配与入口整合报告.md。各报告对应当次测试边界；最新代码以 160f96e 为准。</w:t>
       </w:r>
     </w:p>
     <w:sectPr>

</xml_diff>

<commit_message>
docs: document feedback fixes and verification
</commit_message>
<xml_diff>
--- a/docs/manuals/01-心情日历-功能需求说明书.docx
+++ b/docs/manuals/01-心情日历-功能需求说明书.docx
@@ -232,19 +232,8 @@
             </w:tcMar>
           </w:tcPr>
           <w:p>
-            <w:pPr>
-              <w:keepNext w:val="0"/>
-              <w:spacing w:after="0" w:line="252" w:lineRule="auto"/>
-            </w:pPr>
             <w:r>
-              <w:rPr>
-                <w:rFonts w:ascii="Calibri" w:hAnsi="Calibri" w:eastAsia="微软雅黑"/>
-                <w:b w:val="0"/>
-                <w:i w:val="0"/>
-                <w:color w:val="000000"/>
-                <w:sz w:val="20"/>
-              </w:rPr>
-              <w:t>仓库与功能代码基线 160f96e</w:t>
+              <w:t>仓库与功能代码基线 698d6fe</w:t>
             </w:r>
           </w:p>
         </w:tc>
@@ -293,19 +282,8 @@
             </w:tcMar>
           </w:tcPr>
           <w:p>
-            <w:pPr>
-              <w:keepNext w:val="0"/>
-              <w:spacing w:after="0" w:line="252" w:lineRule="auto"/>
-            </w:pPr>
             <w:r>
-              <w:rPr>
-                <w:rFonts w:ascii="Calibri" w:hAnsi="Calibri" w:eastAsia="微软雅黑"/>
-                <w:b w:val="0"/>
-                <w:i w:val="0"/>
-                <w:color w:val="000000"/>
-                <w:sz w:val="20"/>
-              </w:rPr>
-              <w:t>2026年9月20日</w:t>
+              <w:t>2026年9月22日</w:t>
             </w:r>
           </w:p>
         </w:tc>
@@ -557,14 +535,7 @@
         <w:spacing w:after="20" w:line="252" w:lineRule="auto"/>
       </w:pPr>
       <w:r>
-        <w:rPr>
-          <w:rFonts w:ascii="Calibri" w:hAnsi="Calibri" w:eastAsia="微软雅黑"/>
-          <w:b w:val="0"/>
-          <w:i w:val="0"/>
-          <w:color w:val="000000"/>
-          <w:sz w:val="22"/>
-        </w:rPr>
-        <w:t>5 非功能要求与验收</w:t>
+        <w:t>5 非功能要求与验收    7 反馈问题修复需求</w:t>
       </w:r>
     </w:p>
     <w:p>
@@ -4542,6 +4513,41 @@
         <w:t>本次同步确认：主要原有页面已统一主题并补充横屏、大字体和紧凑尺寸适配；AA退出审核已并入教师预警工作台。设置、编辑和详情仍需补充多状态交互截图及无障碍验收。验证依据：docs/testing/ 下的 2026-09-18-功能测试报告.md、2026-09-18-UI优化验收.md 和 2026-09-19-界面适配与入口整合报告.md。各报告对应当次测试边界；最新代码以 160f96e 为准。</w:t>
       </w:r>
     </w:p>
+    <w:p>
+      <w:pPr>
+        <w:pStyle w:val="Heading1"/>
+      </w:pPr>
+      <w:r>
+        <w:rPr>
+          <w:color w:val="000000"/>
+        </w:rPr>
+        <w:t>7 反馈问题修复需求</w:t>
+      </w:r>
+    </w:p>
+    <w:p>
+      <w:pPr>
+        <w:spacing w:after="120"/>
+      </w:pPr>
+      <w:r>
+        <w:t>本轮恢复情绪折线、周趋势和月趋势，记录天数按日期去重；增加仅基于记录规律的自我反思提示，不读取日记关键词，不输出疾病诊断。PHQ-9和GAD-7仍是风险评估核心，分析页必须回显本人已完成量表的类型、分数、结果范围、完成时间和答题完整性。</w:t>
+      </w:r>
+    </w:p>
+    <w:p>
+      <w:pPr>
+        <w:spacing w:after="120"/>
+      </w:pPr>
+      <w:r>
+        <w:t>AA随访在没有真实数据时提供由学生主动开启的只读合成演示，必须标明演示身份且不得写入真实记录。纪念日支持点击编辑并校验日期。首页提供当天记录横向预览和今日收获，日期详情提供当日复盘及原逐条编辑入口。</w:t>
+      </w:r>
+    </w:p>
+    <w:p>
+      <w:pPr>
+        <w:spacing w:after="120"/>
+      </w:pPr>
+      <w:r>
+        <w:t>验收以2026-09-22反馈问题修复与测试报告为准。医疗边界为：趋势与反思只用于自我回顾，不能称为CBT医学诊断模型。</w:t>
+      </w:r>
+    </w:p>
     <w:sectPr>
       <w:footerReference w:type="default" r:id="rId9"/>
       <w:pgSz w:w="12240" w:h="15840"/>

</xml_diff>

<commit_message>
feat: add interactive privacy-safe mood insights
</commit_message>
<xml_diff>
--- a/docs/manuals/01-心情日历-功能需求说明书.docx
+++ b/docs/manuals/01-心情日历-功能需求说明书.docx
@@ -4548,6 +4548,34 @@
         <w:t>验收以2026-09-22反馈问题修复与测试报告为准。医疗边界为：趋势与反思只用于自我回顾，不能称为CBT医学诊断模型。</w:t>
       </w:r>
     </w:p>
+    <w:p>
+      <w:r>
+        <w:br w:type="page"/>
+      </w:r>
+    </w:p>
+    <w:p>
+      <w:pPr>
+        <w:pStyle w:val="Heading1"/>
+      </w:pPr>
+      <w:r>
+        <w:t>8 深度洞察交互与扩展需求</w:t>
+      </w:r>
+    </w:p>
+    <w:p>
+      <w:r>
+        <w:t>分析模块默认展示深度洞察，并保留情绪趋势和量表评估两个独立标签。自我反思必须可以点击，打开事件、即时想法、支持与反对证据三个步骤；用户可以回看系统选定日期的原始记录，或进入现有编辑器继续书写。</w:t>
+      </w:r>
+    </w:p>
+    <w:p>
+      <w:r>
+        <w:t>首页当天记录和分析页本月历史记录均采用横向滑动卡片。卡片显示日期、时间、情绪和文字摘要，点击后进入日期详情。深度洞察增加最近连续记录、最长连续记录、情绪波动程度、常用记录时段、高低点日期和下一步建议。</w:t>
+      </w:r>
+    </w:p>
+    <w:p>
+      <w:r>
+        <w:t>CBT仅作为结构化自我反思方法，不作为医学模型或诊断器。系统不得从日记关键词推断抑郁症、焦虑症、创伤后应激障碍或双相情感障碍；需要风险筛查时应引导学生完成PHQ-9或GAD-7。</w:t>
+      </w:r>
+    </w:p>
     <w:sectPr>
       <w:footerReference w:type="default" r:id="rId9"/>
       <w:pgSz w:w="12240" w:h="15840"/>

</xml_diff>

<commit_message>
feat: separate student and teacher application shells
</commit_message>
<xml_diff>
--- a/docs/manuals/01-心情日历-功能需求说明书.docx
+++ b/docs/manuals/01-心情日历-功能需求说明书.docx
@@ -4576,6 +4576,39 @@
         <w:t>CBT仅作为结构化自我反思方法，不作为医学模型或诊断器。系统不得从日记关键词推断抑郁症、焦虑症、创伤后应激障碍或双相情感障碍；需要风险筛查时应引导学生完成PHQ-9或GAD-7。</w:t>
       </w:r>
     </w:p>
+    <w:p>
+      <w:r>
+        <w:br w:type="page"/>
+      </w:r>
+    </w:p>
+    <w:p>
+      <w:pPr>
+        <w:pStyle w:val="Heading1"/>
+      </w:pPr>
+      <w:r>
+        <w:t>9 双角色入口与信息归属需求</w:t>
+      </w:r>
+    </w:p>
+    <w:p>
+      <w:r>
+        <w:t>系统必须提供学生和教师两个相互独立的入口。学生身份进入个人情绪管理空间，教师身份直接进入预警工作台。正式环境由认证服务返回的角色决定落地页，客户端不能通过普通按钮把学生会话提升为教师会话；原型只在独立演示入口提供固定DEMO身份。</w:t>
+      </w:r>
+    </w:p>
+    <w:p>
+      <w:r>
+        <w:t>学生端主导航固定为情绪日历、数据洞察、随访任务和我的。学生页面不显示预警工作台、教师工单、确认预警、启动干预、结束处理或退出审核。未进入随访的学生看到空状态，不能看到其他学生或教师待办。</w:t>
+      </w:r>
+    </w:p>
+    <w:p>
+      <w:r>
+        <w:t>教师端主导航固定为预警工作台和账号设置。工作台使用待确认、处理中和已结束三个队列，列表只显示脱敏代号、触发原因、关注等级和更新时间。详情页依次显示基本信息、必要摘要、当前允许操作、状态与处理历史。</w:t>
+      </w:r>
+    </w:p>
+    <w:p>
+      <w:r>
+        <w:t>权限必须同时在界面和接口层落实。学生接口只返回本人数据；教师接口只返回责任范围内的脱敏摘要、处理记录和必要随访状态；私人日记、逐题答案和原始健康数据不得进入教师响应。</w:t>
+      </w:r>
+    </w:p>
     <w:sectPr>
       <w:footerReference w:type="default" r:id="rId9"/>
       <w:pgSz w:w="12240" w:h="15840"/>

</xml_diff>